<commit_message>
Completar apartado 4.2 de analisis y variables
</commit_message>
<xml_diff>
--- a/docs/memoria/TFM_definitivo.docx
+++ b/docs/memoria/TFM_definitivo.docx
@@ -1,6 +1,6 @@
 
 <file path=word/document.xml><?xml version="1.0" encoding="utf-8"?>
-<w:document xmlns:mc="http://schemas.openxmlformats.org/markup-compatibility/2006" xmlns:o="urn:schemas-microsoft-com:office:office" xmlns:r="http://schemas.openxmlformats.org/officeDocument/2006/relationships" xmlns:m="http://schemas.openxmlformats.org/officeDocument/2006/math" xmlns:v="urn:schemas-microsoft-com:vml" xmlns:wp="http://schemas.openxmlformats.org/drawingml/2006/wordprocessingDrawing" xmlns:w10="urn:schemas-microsoft-com:office:word" xmlns:w="http://schemas.openxmlformats.org/wordprocessingml/2006/main" xmlns:wne="http://schemas.microsoft.com/office/word/2006/wordml" xmlns:sl="http://schemas.openxmlformats.org/schemaLibrary/2006/main" xmlns:a="http://schemas.openxmlformats.org/drawingml/2006/main" xmlns:pic="http://schemas.openxmlformats.org/drawingml/2006/picture" xmlns:c="http://schemas.openxmlformats.org/drawingml/2006/chart" xmlns:lc="http://schemas.openxmlformats.org/drawingml/2006/lockedCanvas" xmlns:dgm="http://schemas.openxmlformats.org/drawingml/2006/diagram" xmlns:wps="http://schemas.microsoft.com/office/word/2010/wordprocessingShape" xmlns:wpg="http://schemas.microsoft.com/office/word/2010/wordprocessingGroup" xmlns:w14="http://schemas.microsoft.com/office/word/2010/wordml" xmlns:w15="http://schemas.microsoft.com/office/word/2012/wordml" xmlns:w16="http://schemas.microsoft.com/office/word/2018/wordml" xmlns:w16cex="http://schemas.microsoft.com/office/word/2018/wordml/cex" xmlns:w16cid="http://schemas.microsoft.com/office/word/2016/wordml/cid" xmlns="http://schemas.microsoft.com/office/tasks/2019/documenttasks" xmlns:cr="http://schemas.microsoft.com/office/comments/2020/reactions">
+<w:document xmlns:ns1="http://schemas.openxmlformats.org/officeDocument/2006/relationships" xmlns:w="http://schemas.openxmlformats.org/wordprocessingml/2006/main">
   <w:body>
     <w:p>
       <w:pPr>
@@ -706,6 +706,61 @@
       </w:r>
     </w:p>
     <w:p>
+      <w:r>
+        <w:t xml:space="preserve">El análisis exploratorio se plantea como el puente entre la extracción y normalización del apartado 4.1 y la comparación de modelos predictivos del apartado 4.3. Su finalidad no es únicamente describir el conjunto de datos, sino comprobar que las observaciones son coherentes, que las variables tienen significado agronómico y que la tabla final puede utilizarse para estimar necesidades de riego sin introducir fuga de información. El flujo se implementa en src/features/feature_engineering.py, que toma como entrada las tablas interim normalizadas y genera una tabla diaria de modelización.</w:t>
+      </w:r>
+    </w:p>
+    <w:p>
+      <w:r>
+        <w:t xml:space="preserve">El piloto trabaja con el ciclo de pimiento bajo invernadero en la estación SiAR AL01 La Mojonera, entre el 1 de mayo y el 30 de septiembre de 2025. El conjunto externo de necesidades hídricas contiene 150 registros y aporta Kc, ET0, ETc, precipitación efectiva y necesidad neta. El fichero de metadatos registra que el periodo solicitado contiene tres fechas no devueltas por la fuente y dos registros con variables meteorológicas ausentes. Por tanto, el primer resultado del EDA es una advertencia metodológica: el ciclo permite probar el flujo completo, pero los huecos de calendario y las ausencias deben mantenerse visibles durante el modelado.</w:t>
+      </w:r>
+    </w:p>
+    <w:p>
+      <w:r>
+        <w:t xml:space="preserve">La exploración inicial se organiza en cuatro controles. Primero se verifica la unicidad de la clave formada por estación, cultivo y fecha. Segundo se comprueba la continuidad del calendario, ya que un modelo temporal puede interpretar erróneamente un salto de varios días como observaciones consecutivas. Tercero se analizan valores ausentes y avisos de calidad, diferenciando ausencias puntuales de ausencia estructural de una variable. Cuarto se revisan reglas agronómicas básicas: temperatura mínima menor o igual que la media y la máxima, humedad entre 0 % y 100 %, magnitudes no negativas para precipitación, viento, radiación, ET0 y necesidad neta, y coherencia entre ETc, Kc, ET0 y precipitación efectiva.</w:t>
+      </w:r>
+    </w:p>
+    <w:p>
+      <w:r>
+        <w:t xml:space="preserve">Las variables principales del análisis son temperatura media, máxima y mínima, humedad relativa, viento, radiación, precipitación, ET0 Penman-Monteith, precipitación efectiva, coeficiente de cultivo y necesidad neta de riego. La temperatura y la radiación ayudan a caracterizar la demanda evaporativa; la humedad relativa permite aproximar el déficit de presión de vapor; la lluvia y la precipitación efectiva representan aportes naturales; y Kc introduce la fase del cultivo en la estimación de ETc. La inspección de series temporales, histogramas, diagramas de caja y correlaciones debe confirmar que ET0 aumenta con temperatura y radiación, que tiende a reducirse con mayor humedad relativa y que la precipitación aparece como un fenómeno más irregular y concentrado.</w:t>
+      </w:r>
+    </w:p>
+    <w:p>
+      <w:r>
+        <w:t xml:space="preserve">El ciclo mayo-septiembre es adecuado para un primer prototipo porque cubre una fase de alta demanda hídrica en Almería. Aun así, no debe interpretarse como un histórico suficiente para generalizar a otros cultivos, estaciones o campañas. El modelo final deberá entrenarse con más campañas y, si el alcance lo permite, con varias estaciones, de forma que la validación mida la capacidad de generalización ante años y condiciones no observadas. Esta cautela es especialmente importante porque el sistema se concibe como apoyo a la decisión y no como sustituto del criterio agronómico.</w:t>
+      </w:r>
+    </w:p>
+    <w:p>
+      <w:r>
+        <w:t xml:space="preserve">La preparación de variables se estructura en tres grupos. El primer grupo incluye variables temporales derivadas de la fecha: año, mes, semana, día del año y codificación cíclica del día del año mediante seno y coseno. Esta codificación permite representar la estacionalidad sin crear una discontinuidad artificial entre diciembre y enero. El segundo grupo incorpora variables agrometeorológicas derivadas: amplitud térmica diaria, déficit de presión de vapor, ETc estimada a partir de ET0 y Kc, y necesidad neta estimada como max(ETc - precipitación efectiva, 0). El tercer grupo recoge retardos, acumulados y medias móviles de 1, 3, 7 y 14 días para las variables de mayor interés, entre ellas ET0, precipitación, precipitación efectiva, temperatura, humedad, radiación y necesidad neta.</w:t>
+      </w:r>
+    </w:p>
+    <w:p>
+      <w:r>
+        <w:t xml:space="preserve">Estas variables retardadas son necesarias porque la decisión de riego no depende solo del estado meteorológico del día actual. La demanda acumulada, las lluvias recientes y la evolución de la evapotranspiración condicionan el balance hídrico del suelo y la conveniencia de aplicar agua. En el prototipo, los acumulados de precipitación y precipitación efectiva se calculan como sumas, mientras que ET0, temperatura, humedad y radiación se resumen mediante medias móviles. Todas estas transformaciones se calculan con desplazamiento temporal, utilizando únicamente información disponible antes del día que se quiere predecir.</w:t>
+      </w:r>
+    </w:p>
+    <w:p>
+      <w:r>
+        <w:t xml:space="preserve">La variable objetivo se define como target_net_irrigation_need_mm, procedente de la necesidad neta diaria del producto de necesidades hídricas de SiAR. Esta variable no equivale a riego real aplicado en una parcela, sino a una referencia agronómica calculada que permite entrenar y comparar modelos en una primera fase. Por ello, las métricas del apartado 4.3 evaluarán la capacidad de reproducir o anticipar esa referencia, no un ahorro de agua observado en campo. Cuando se disponga de registros reales de riego, la misma estructura podrá reutilizarse sustituyendo o complementando la variable objetivo.</w:t>
+      </w:r>
+    </w:p>
+    <w:p>
+      <w:r>
+        <w:t xml:space="preserve">La tabla final de modelización se construye mediante una unión por station_code y observed_date entre la tabla meteorológica diaria y la tabla de necesidades hídricas. Se conserva además el cultivo, el estado de calidad y la trazabilidad de origen. Si la fila meteorológica o la fila agronómica presenta avisos, la fila resultante queda marcada como WARN para que pueda excluirse, imputarse o analizarse de forma diferenciada durante el entrenamiento. Esta estrategia evita convertir ausencias o anomalías en ceros y mantiene visible la incertidumbre de los datos.</w:t>
+      </w:r>
+    </w:p>
+    <w:p>
+      <w:r>
+        <w:t xml:space="preserve">La separación entre entrenamiento, validación y prueba debe respetar el orden temporal. Una partición aleatoria mezclaría días próximos de la misma campaña y podría producir una estimación demasiado optimista del error. La opción coherente para este caso es entrenar con fechas anteriores y validar con fechas posteriores; cuando se amplíe el histórico, también será conveniente reservar campañas completas o estaciones completas para evaluar transferencia temporal y espacial. Las imputaciones, escalados y codificaciones deberán ajustarse solo con el conjunto de entrenamiento y aplicarse después sobre validación y prueba.</w:t>
+      </w:r>
+    </w:p>
+    <w:p>
+      <w:r>
+        <w:t xml:space="preserve">El resultado del apartado 4.2 es una tabla analítica diaria lista para el apartado 4.3. Cada registro representa una combinación de fecha, estación y cultivo, con variables meteorológicas depuradas, indicadores temporales, variables agronómicas, retardos, acumulados, medias móviles y una referencia de necesidad neta. Esta estructura mantiene la trazabilidad del apartado 4.1 y prepara una base reproducible para comparar modelos simples y avanzados con el mismo criterio de evaluación.</w:t>
+      </w:r>
+    </w:p>
+    <w:p>
       <w:pPr>
         <w:pStyle w:val="Heading2"/>
       </w:pPr>
@@ -1389,7 +1444,7 @@
       </w:r>
     </w:p>
     <w:sectPr>
-      <w:footerReference w:type="default" r:id="rId6"/>
+      <w:footerReference w:type="default" ns1:id="rId6"/>
       <w:pgSz w:h="16838" w:w="11906" w:orient="portrait"/>
       <w:pgMar w:bottom="1440" w:top="1440" w:left="1440" w:right="1440" w:header="720" w:footer="720"/>
       <w:pgNumType w:start="1"/>

</xml_diff>

<commit_message>
Completar desarrollo y evaluacion del apartado 4.3
</commit_message>
<xml_diff>
--- a/docs/memoria/TFM_definitivo.docx
+++ b/docs/memoria/TFM_definitivo.docx
@@ -766,6 +766,229 @@
       </w:pPr>
       <w:r>
         <w:t>4.3. Desarrollo y evaluación del modelo predictivo</w:t>
+      </w:r>
+    </w:p>
+    <w:p>
+      <w:r>
+        <w:t xml:space="preserve">El modelo predictivo se plantea como una demostración reproducible de la capa analítica del DSS. Su objetivo es anticipar la necesidad neta diaria publicada por SiAR para el cultivo de pimiento en la estación AL01 La Mojonera. Esta variable constituye una referencia agronómica calculada, no una medición del riego realmente aplicado ni de la respuesta del cultivo. En consecuencia, la evaluación permite comprobar el funcionamiento del flujo de modelización, pero no demostrar una optimización real del agua de riego.</w:t>
+      </w:r>
+    </w:p>
+    <w:p>
+      <w:r>
+        <w:rPr>
+          <w:b/>
+        </w:rPr>
+        <w:t xml:space="preserve">4.3.1. Diseño experimental</w:t>
+      </w:r>
+    </w:p>
+    <w:p>
+      <w:r>
+        <w:t xml:space="preserve">El conjunto contiene 150 registros del ciclo comprendido entre el 1 de mayo y el 30 de septiembre de 2025. Dos registros no disponen de objetivo válido, por lo que la evaluación utiliza 148 observaciones. La separación respeta estrictamente el orden temporal: 103 observaciones para entrenamiento, 22 para validación y 23 para prueba. El entrenamiento termina el 16 de agosto, la validación el 7 de septiembre y la prueba comprende del 8 al 30 de septiembre. El tramo de prueba no interviene en la elección del modelo.</w:t>
+      </w:r>
+    </w:p>
+    <w:p>
+      <w:r>
+        <w:t xml:space="preserve">La variable objetivo es target_net_irrigation_need_mm. Como predictores se utilizan el coeficiente de cultivo conocido para la fecha, la codificación cíclica del día del año, retardos de 1, 3 y 7 días de la necesidad neta y medias móviles históricas de 3, 7 y 14 días. Los retardos respetan el calendario: si falta el día anterior, el valor de un retardo de un día se mantiene ausente y no se sustituye por la última fila disponible.</w:t>
+      </w:r>
+    </w:p>
+    <w:p>
+      <w:r>
+        <w:t xml:space="preserve">Se excluyen expresamente ET0, ETc y precipitación efectiva del mismo día. La etiqueta SiAR se obtiene mediante max(ET0 × Kc - Pe, 0); incluir estos campos permitiría reconstruir el resultado algebraicamente y produciría métricas muy altas sin capacidad predictiva real. Los valores ausentes de los predictores se imputan con la mediana aprendida exclusivamente en el periodo de entrenamiento.</w:t>
+      </w:r>
+    </w:p>
+    <w:p>
+      <w:r>
+        <w:rPr>
+          <w:b/>
+        </w:rPr>
+        <w:t xml:space="preserve">4.3.2. Modelos comparados</w:t>
+      </w:r>
+    </w:p>
+    <w:p>
+      <w:r>
+        <w:t xml:space="preserve">Se comparan tres enfoques con distinta complejidad:</w:t>
+      </w:r>
+    </w:p>
+    <w:p>
+      <w:r>
+        <w:t xml:space="preserve">1. Persistencia: utiliza como predicción la necesidad observada el día</w:t>
+      </w:r>
+    </w:p>
+    <w:p>
+      <w:r>
+        <w:t xml:space="preserve">anterior. Es el baseline predictivo mínimo que cualquier modelo debe superar.</w:t>
+      </w:r>
+    </w:p>
+    <w:p>
+      <w:r>
+        <w:t xml:space="preserve">2. Regresión Ridge: modelo lineal regularizado, precedido por imputación y</w:t>
+      </w:r>
+    </w:p>
+    <w:p>
+      <w:r>
+        <w:t xml:space="preserve">estandarización. Aporta una referencia interpretable y limita el sobreajuste.</w:t>
+      </w:r>
+    </w:p>
+    <w:p>
+      <w:r>
+        <w:t xml:space="preserve">3. Random Forest: conjunto de 300 árboles con profundidad y tamaño mínimo de</w:t>
+      </w:r>
+    </w:p>
+    <w:p>
+      <w:r>
+        <w:t xml:space="preserve">hoja restringidos. Permite representar relaciones no lineales manteniendo una configuración conservadora para el reducido tamaño muestral.</w:t>
+      </w:r>
+    </w:p>
+    <w:p>
+      <w:r>
+        <w:t xml:space="preserve">La selección entre los modelos de aprendizaje se realiza mediante el menor MAE en validación. Una vez elegido, se vuelve a ajustar con entrenamiento y validación y se evalúa una sola vez sobre el tramo final. Se fija la semilla 42 para que la comparación sea reproducible.</w:t>
+      </w:r>
+    </w:p>
+    <w:p>
+      <w:r>
+        <w:rPr>
+          <w:b/>
+        </w:rPr>
+        <w:t xml:space="preserve">4.3.3. Métricas</w:t>
+      </w:r>
+    </w:p>
+    <w:p>
+      <w:r>
+        <w:t xml:space="preserve">Se emplean cuatro métricas expresadas en milímetros:</w:t>
+      </w:r>
+    </w:p>
+    <w:p>
+      <w:r>
+        <w:t xml:space="preserve">- MAE diario, que resume el error absoluto medio;</w:t>
+      </w:r>
+    </w:p>
+    <w:p>
+      <w:r>
+        <w:t xml:space="preserve">- RMSE diario, que penaliza con mayor intensidad los errores grandes;</w:t>
+      </w:r>
+    </w:p>
+    <w:p>
+      <w:r>
+        <w:t xml:space="preserve">- sesgo medio, positivo si el modelo sobreestima y negativo si infraestima;</w:t>
+      </w:r>
+    </w:p>
+    <w:p>
+      <w:r>
+        <w:t xml:space="preserve">- MAE semanal, calculado sobre acumulados de bloques de hasta siete días.</w:t>
+      </w:r>
+    </w:p>
+    <w:p>
+      <w:r>
+        <w:t xml:space="preserve">El MAE es la métrica principal de selección porque mantiene la unidad original y es menos sensible que el RMSE a episodios puntuales. El sesgo es relevante para el DSS, ya que una desviación sistemática puede traducirse en exceso o déficit de agua recomendado.</w:t>
+      </w:r>
+    </w:p>
+    <w:p>
+      <w:r>
+        <w:rPr>
+          <w:b/>
+        </w:rPr>
+        <w:t xml:space="preserve">4.3.4. Resultados</w:t>
+      </w:r>
+    </w:p>
+    <w:p>
+      <w:r>
+        <w:t xml:space="preserve">Los resultados de validación fueron los siguientes:</w:t>
+      </w:r>
+    </w:p>
+    <w:p>
+      <w:r>
+        <w:t xml:space="preserve">Modelo	MAE diario	RMSE diario	Sesgo diario	MAE semanal</w:t>
+      </w:r>
+    </w:p>
+    <w:p>
+      <w:r>
+        <w:t xml:space="preserve">Persistencia	0,441	0,845	0,191	1,197</w:t>
+      </w:r>
+    </w:p>
+    <w:p>
+      <w:r>
+        <w:t xml:space="preserve">Ridge	0,380	0,465	0,057	1,370</w:t>
+      </w:r>
+    </w:p>
+    <w:p>
+      <w:r>
+        <w:t xml:space="preserve">Random Forest	1,453	1,935	1,413	7,770</w:t>
+      </w:r>
+    </w:p>
+    <w:p>
+      <w:r>
+        <w:t xml:space="preserve">Ridge obtuvo el menor MAE de validación y fue seleccionado antes de consultar el periodo de prueba. En el tramo final se obtuvieron estas métricas:</w:t>
+      </w:r>
+    </w:p>
+    <w:p>
+      <w:r>
+        <w:t xml:space="preserve">Modelo	MAE diario	RMSE diario	Sesgo diario	MAE semanal</w:t>
+      </w:r>
+    </w:p>
+    <w:p>
+      <w:r>
+        <w:t xml:space="preserve">Persistencia	0,120	0,156	-0,000	0,172</w:t>
+      </w:r>
+    </w:p>
+    <w:p>
+      <w:r>
+        <w:t xml:space="preserve">Ridge seleccionado	0,620	0,679	-0,606	3,482</w:t>
+      </w:r>
+    </w:p>
+    <w:p>
+      <w:r>
+        <w:t xml:space="preserve">Random Forest	0,486	0,505	0,486	2,794</w:t>
+      </w:r>
+    </w:p>
+    <w:p>
+      <w:r>
+        <w:t xml:space="preserve">El resultado de prueba no demuestra una mejora del aprendizaje automático sobre el baseline. Aunque Ridge fue superior durante la validación, en septiembre infraestimó la referencia y quedó claramente por detrás de la persistencia. El Random Forest también mostró peor error que el baseline y un sesgo positivo. La diferencia entre validación y prueba indica inestabilidad temporal y probable cambio en el patrón de la serie, algo esperable al trabajar con un único ciclo y una curva de cultivo que evoluciona durante la campaña.</w:t>
+      </w:r>
+    </w:p>
+    <w:p>
+      <w:r>
+        <w:rPr>
+          <w:b/>
+        </w:rPr>
+        <w:t xml:space="preserve">4.3.5. Interpretación y limitaciones</w:t>
+      </w:r>
+    </w:p>
+    <w:p>
+      <w:r>
+        <w:t xml:space="preserve">La principal conclusión es metodológica: una comparación temporal y un baseline sencillo evitan atribuir al modelo una mejora que no se sostiene fuera del periodo usado para seleccionarlo. No sería correcto desplegar Ridge como sustituto del método agronómico con la evidencia actual. Para el piloto, la persistencia puede conservarse como referencia predictiva y la fórmula de SiAR como baseline agronómico explicable.</w:t>
+      </w:r>
+    </w:p>
+    <w:p>
+      <w:r>
+        <w:t xml:space="preserve">La muestra procede de una sola estación, un cultivo y una campaña. Además, la etiqueta reproduce un cálculo de SiAR y no incorpora humedad del suelo, microclima del invernadero, eficiencia de la instalación, riego aplicado, drenaje ni producción. Por ello, estas métricas no permiten afirmar ahorro de agua, reducción del estrés o generalización a otras parcelas.</w:t>
+      </w:r>
+    </w:p>
+    <w:p>
+      <w:r>
+        <w:t xml:space="preserve">Antes de reconsiderar el despliegue de un modelo se deben incorporar varias campañas, nuevas estaciones y variables realmente disponibles en el instante de predicción. La evolución científicamente más útil es estimar ET0 futura con históricos meteorológicos y predicciones AEMET, y posteriormente aprender una corrección sobre el baseline cuando existan sensores y registros reales de riego y respuesta agronómica.</w:t>
+      </w:r>
+    </w:p>
+    <w:p>
+      <w:r>
+        <w:rPr>
+          <w:b/>
+        </w:rPr>
+        <w:t xml:space="preserve">4.3.6. Reproducibilidad</w:t>
+      </w:r>
+    </w:p>
+    <w:p>
+      <w:r>
+        <w:t xml:space="preserve">El entrenamiento se implementa en src/models/train_evaluate.py. El comando genera un informe JSON, las predicciones del tramo de prueba y un modelo serializado localmente:</w:t>
+      </w:r>
+    </w:p>
+    <w:p>
+      <w:r>
+        <w:t xml:space="preserve">python -m src.models.train_evaluate</w:t>
+      </w:r>
+    </w:p>
+    <w:p>
+      <w:r>
+        <w:t xml:space="preserve">El informe auditado y las predicciones utilizadas en este apartado se versionan en docs/data_samples/model_evaluation_4_3.json y docs/data_samples/model_predictions_4_3.csv. El modelo binario se excluye de Git porque es un artefacto reproducible. Las pruebas automatizadas verifican la separación temporal, el tratamiento de huecos, la exclusión de variables del mismo día y la reproducibilidad de las predicciones.</w:t>
       </w:r>
     </w:p>
     <w:p>

</xml_diff>

<commit_message>
docs: actualizar el apartado 3.2 con el sistema de recomendación implementado
</commit_message>
<xml_diff>
--- a/docs/memoria/TFM_definitivo.docx
+++ b/docs/memoria/TFM_definitivo.docx
@@ -2590,7 +2590,7 @@
         <w:t>Configuración.</w:t>
       </w:r>
       <w:r>
-        <w:t xml:space="preserve"> La ubicación, el cultivo y el periodo se proporcionan como parámetros de ejecución. En una fase posterior procederán de la interfaz del usuario.</w:t>
+        <w:t xml:space="preserve"> La ubicación, el cultivo y el periodo se proporcionan como parámetros de ejecución. En la aplicación del DSS el usuario introduce además la fecha de emisión, el horizonte y los datos de la parcela; el cultivo y la estación quedan fijados por el caso piloto.</w:t>
       </w:r>
     </w:p>
     <w:p>
@@ -2730,7 +2730,7 @@
         <w:t>DSS y presentación.</w:t>
       </w:r>
       <w:r>
-        <w:t xml:space="preserve"> El motor de recomendación y el cuadro de mando utilizarán las predicciones, las reglas agronómicas y los parámetros de la parcela. Esta capa todavía está en desarrollo y no se presenta como implementada.</w:t>
+        <w:t xml:space="preserve"> El motor de recomendación combina la referencia agronómica, la ET0 reciente, el calendario del cultivo y los parámetros de la parcela, aplica un conjunto de reglas explícitas y genera una recomendación diaria y semanal con su explicación. Se consulta mediante una aplicación de demostración en Streamlit o desde la línea de comandos. Su diseño, su funcionamiento y su validación se desarrollan en el capítulo 5.</w:t>
       </w:r>
     </w:p>
     <w:p>
@@ -2761,7 +2761,7 @@
           <w:rFonts w:ascii="Consolas" w:hAnsi="Consolas"/>
           <w:sz w:val="17"/>
         </w:rPr>
-        <w:t xml:space="preserve">           -&gt; análisis/modelos -&gt; evidencias -&gt; futuro motor DSS</w:t>
+        <w:t xml:space="preserve">           -&gt; análisis/modelos -&gt; evidencias -&gt; motor DSS -&gt; aplicación</w:t>
       </w:r>
     </w:p>
     <w:p>
@@ -3243,7 +3243,7 @@
                 <w:color w:val="000000"/>
                 <w:sz w:val="16"/>
               </w:rPr>
-              <w:t>Jupyter y Visual Studio Code</w:t>
+              <w:t>Streamlit</w:t>
             </w:r>
           </w:p>
         </w:tc>
@@ -3268,7 +3268,7 @@
                 <w:color w:val="000000"/>
                 <w:sz w:val="16"/>
               </w:rPr>
-              <w:t>Exploración, demostración y desarrollo local</w:t>
+              <w:t>Aplicación de demostración del sistema de recomendación</w:t>
             </w:r>
           </w:p>
         </w:tc>
@@ -3324,7 +3324,7 @@
                 <w:color w:val="000000"/>
                 <w:sz w:val="16"/>
               </w:rPr>
-              <w:t>Git y GitHub</w:t>
+              <w:t>Jupyter y Visual Studio Code</w:t>
             </w:r>
           </w:p>
         </w:tc>
@@ -3350,7 +3350,7 @@
                 <w:color w:val="000000"/>
                 <w:sz w:val="16"/>
               </w:rPr>
-              <w:t>Versionado, ramas, revisión e integración del trabajo</w:t>
+              <w:t>Exploración, demostración y desarrollo local</w:t>
             </w:r>
           </w:p>
         </w:tc>
@@ -3406,7 +3406,7 @@
                 <w:color w:val="000000"/>
                 <w:sz w:val="16"/>
               </w:rPr>
-              <w:t>MySQL</w:t>
+              <w:t>Git y GitHub</w:t>
             </w:r>
           </w:p>
         </w:tc>
@@ -3431,7 +3431,7 @@
                 <w:color w:val="000000"/>
                 <w:sz w:val="16"/>
               </w:rPr>
-              <w:t>Persistencia relacional de catálogos, recomendaciones y metadatos</w:t>
+              <w:t>Versionado, ramas, revisión e integración del trabajo</w:t>
             </w:r>
           </w:p>
         </w:tc>
@@ -3456,7 +3456,7 @@
                 <w:color w:val="000000"/>
                 <w:sz w:val="16"/>
               </w:rPr>
-              <w:t>Diseñado, pendiente de implementación.</w:t>
+              <w:t>Implementado.</w:t>
             </w:r>
           </w:p>
         </w:tc>
@@ -3487,7 +3487,7 @@
                 <w:color w:val="000000"/>
                 <w:sz w:val="16"/>
               </w:rPr>
-              <w:t>Apache Hop</w:t>
+              <w:t>MySQL</w:t>
             </w:r>
           </w:p>
         </w:tc>
@@ -3513,7 +3513,7 @@
                 <w:color w:val="000000"/>
                 <w:sz w:val="16"/>
               </w:rPr>
-              <w:t>Orquestación visual de cargas ETL</w:t>
+              <w:t>Persistencia relacional de catálogos, recomendaciones y metadatos</w:t>
             </w:r>
           </w:p>
         </w:tc>
@@ -3539,7 +3539,7 @@
                 <w:color w:val="000000"/>
                 <w:sz w:val="16"/>
               </w:rPr>
-              <w:t>Propuesto; el flujo actual se ejecuta con módulos Python.</w:t>
+              <w:t>Diseñado, pendiente de implementación.</w:t>
             </w:r>
           </w:p>
         </w:tc>
@@ -3569,7 +3569,7 @@
                 <w:color w:val="000000"/>
                 <w:sz w:val="16"/>
               </w:rPr>
-              <w:t>Power BI o Tableau</w:t>
+              <w:t>Apache Hop</w:t>
             </w:r>
           </w:p>
         </w:tc>
@@ -3594,7 +3594,7 @@
                 <w:color w:val="000000"/>
                 <w:sz w:val="16"/>
               </w:rPr>
-              <w:t>Interfaz de consulta y visualización final</w:t>
+              <w:t>Orquestación visual de cargas ETL</w:t>
             </w:r>
           </w:p>
         </w:tc>
@@ -3619,7 +3619,7 @@
                 <w:color w:val="000000"/>
                 <w:sz w:val="16"/>
               </w:rPr>
-              <w:t>Previsto para la capa de presentación.</w:t>
+              <w:t>Propuesto; el flujo actual se ejecuta con módulos Python.</w:t>
             </w:r>
           </w:p>
         </w:tc>
@@ -3650,7 +3650,7 @@
                 <w:color w:val="000000"/>
                 <w:sz w:val="16"/>
               </w:rPr>
-              <w:t>Docker</w:t>
+              <w:t>Power BI o Tableau</w:t>
             </w:r>
           </w:p>
         </w:tc>
@@ -3676,7 +3676,7 @@
                 <w:color w:val="000000"/>
                 <w:sz w:val="16"/>
               </w:rPr>
-              <w:t>Entorno reproducible de servicios y despliegue</w:t>
+              <w:t>Análisis agregado de las recomendaciones archivadas</w:t>
             </w:r>
           </w:p>
         </w:tc>
@@ -3702,7 +3702,7 @@
                 <w:color w:val="000000"/>
                 <w:sz w:val="16"/>
               </w:rPr>
-              <w:t>Previsto.</w:t>
+              <w:t>Opcional; la consulta del prototipo se resuelve con Streamlit.</w:t>
             </w:r>
           </w:p>
         </w:tc>
@@ -3732,6 +3732,87 @@
                 <w:color w:val="000000"/>
                 <w:sz w:val="16"/>
               </w:rPr>
+              <w:t>Docker</w:t>
+            </w:r>
+          </w:p>
+        </w:tc>
+        <w:tc>
+          <w:tcPr>
+            <w:tcW w:type="dxa" w:w="3009"/>
+            <w:vAlign w:val="center"/>
+            <w:tcMar>
+              <w:top w:w="90" w:type="dxa"/>
+              <w:start w:w="100" w:type="dxa"/>
+              <w:bottom w:w="90" w:type="dxa"/>
+              <w:end w:w="100" w:type="dxa"/>
+            </w:tcMar>
+          </w:tcPr>
+          <w:p>
+            <w:pPr>
+              <w:jc w:val="center"/>
+            </w:pPr>
+            <w:r>
+              <w:rPr>
+                <w:rFonts w:ascii="Times New Roman" w:hAnsi="Times New Roman"/>
+                <w:color w:val="000000"/>
+                <w:sz w:val="16"/>
+              </w:rPr>
+              <w:t>Entorno reproducible de servicios y despliegue</w:t>
+            </w:r>
+          </w:p>
+        </w:tc>
+        <w:tc>
+          <w:tcPr>
+            <w:tcW w:type="dxa" w:w="3009"/>
+            <w:vAlign w:val="center"/>
+            <w:tcMar>
+              <w:top w:w="90" w:type="dxa"/>
+              <w:start w:w="100" w:type="dxa"/>
+              <w:bottom w:w="90" w:type="dxa"/>
+              <w:end w:w="100" w:type="dxa"/>
+            </w:tcMar>
+          </w:tcPr>
+          <w:p>
+            <w:pPr>
+              <w:jc w:val="center"/>
+            </w:pPr>
+            <w:r>
+              <w:rPr>
+                <w:rFonts w:ascii="Times New Roman" w:hAnsi="Times New Roman"/>
+                <w:color w:val="000000"/>
+                <w:sz w:val="16"/>
+              </w:rPr>
+              <w:t>Previsto.</w:t>
+            </w:r>
+          </w:p>
+        </w:tc>
+      </w:tr>
+      <w:tr>
+        <w:trPr>
+          <w:cantSplit/>
+        </w:trPr>
+        <w:tc>
+          <w:tcPr>
+            <w:tcW w:type="dxa" w:w="3009"/>
+            <w:vAlign w:val="center"/>
+            <w:tcMar>
+              <w:top w:w="90" w:type="dxa"/>
+              <w:start w:w="100" w:type="dxa"/>
+              <w:bottom w:w="90" w:type="dxa"/>
+              <w:end w:w="100" w:type="dxa"/>
+            </w:tcMar>
+            <w:shd w:fill="EAF2F8"/>
+          </w:tcPr>
+          <w:p>
+            <w:pPr>
+              <w:jc w:val="left"/>
+            </w:pPr>
+            <w:r>
+              <w:rPr>
+                <w:rFonts w:ascii="Times New Roman" w:hAnsi="Times New Roman"/>
+                <w:color w:val="000000"/>
+                <w:sz w:val="16"/>
+              </w:rPr>
               <w:t>PySpark</w:t>
             </w:r>
           </w:p>
@@ -3746,6 +3827,7 @@
               <w:bottom w:w="90" w:type="dxa"/>
               <w:end w:w="100" w:type="dxa"/>
             </w:tcMar>
+            <w:shd w:fill="EAF2F8"/>
           </w:tcPr>
           <w:p>
             <w:pPr>
@@ -3771,6 +3853,7 @@
               <w:bottom w:w="90" w:type="dxa"/>
               <w:end w:w="100" w:type="dxa"/>
             </w:tcMar>
+            <w:shd w:fill="EAF2F8"/>
           </w:tcPr>
           <w:p>
             <w:pPr>
@@ -3798,7 +3881,7 @@
         <w:spacing w:after="120"/>
       </w:pPr>
       <w:r>
-        <w:t>Esta clasificación actualiza el planteamiento del anteproyecto. MySQL, Apache Hop, Docker, PySpark y el cuadro de mando forman parte de la arquitectura objetivo, pero no se consideran evidencias terminadas. En el estado actual, el prototipo reproducible se apoya en módulos Python y almacenamiento local por capas.</w:t>
+        <w:t>Esta clasificación actualiza el planteamiento del anteproyecto. MySQL, Apache Hop, Docker, PySpark y un cuadro de mando en Power BI o Tableau forman parte de la arquitectura objetivo, pero no se consideran evidencias terminadas. En el estado actual, el prototipo reproducible se apoya en módulos Python, almacenamiento local por capas y una aplicación en Streamlit para consultar el sistema de recomendación.</w:t>
       </w:r>
     </w:p>
     <w:p>

</xml_diff>

<commit_message>
docs: auditar coherencia del capítulo 6 y estado final
</commit_message>
<xml_diff>
--- a/docs/memoria/TFM_definitivo.docx
+++ b/docs/memoria/TFM_definitivo.docx
@@ -28238,7 +28238,7 @@
         <w:spacing w:after="120"/>
       </w:pPr>
       <w:r>
-        <w:t xml:space="preserve">El balance es de cuatro objetivos cumplidos y tres parciales, y los tres parciales comparten una misma causa. En ninguno de ellos la carencia es metodológica ni de implementación: lo que falta es información a escala de parcela o de recurso hídrico, como la disponibilidad real de agua, las propiedades del suelo o los riegos aplicados. El sistema está preparado para incorporarla, puesto que admite como entradas la eficiencia medida, la dotación y una ET0 prevista, pero no puede suplirla. Esta constatación ordena las líneas de mejora del apartado 6.3.</w:t>
+        <w:t>El balance es de cuatro objetivos cumplidos y tres parciales. Las desviaciones no tienen una única causa: faltan datos hidrológicos y de parcela, diversidad de campañas y cultivos y, para decidir el momento del riego, implementar un balance hídrico del suelo. El motor ya admite como entradas la eficiencia, la dotación y una ET0 prevista, pero incorporar propiedades del suelo y riegos aplicados requiere ampliar tanto los datos como la lógica de decisión. Estas limitaciones ordenan las líneas de mejora del apartado 6.3.</w:t>
       </w:r>
     </w:p>
     <w:p>
@@ -28260,7 +28260,7 @@
         <w:spacing w:after="120"/>
       </w:pPr>
       <w:r>
-        <w:t xml:space="preserve">La aportación principal es un resultado empírico que no estaba previsto en el anteproyecto. Para anticipar la necesidad de riego de un cultivo con calendario definido, separar la estimación en sus dos componentes resulta más eficaz que aumentar la complejidad del modelo. Uno de ellos, la demanda atmosférica, es incierto pero evoluciona de forma gradual; el otro, el coeficiente de cultivo, cambia de forma brusca pero se conoce de antemano. La vía que multiplica la ET0 media de los siete días anteriores por el Kc del día objetivo reduce el MAE de la recomendación a un día frente a la persistencia en un 7 % en desarrollo y en un 25 % en la prueba, y el RMSE de desarrollo en un 18 %. La diferencia se amplía con la anticipación: a siete días, en el periodo de desarrollo, el error del sistema es de 0,48 mm frente a 0,87 mm de la persistencia, porque se mantiene prácticamente estable a lo largo del horizonte. Donde el método se distingue con más claridad es en los cambios de fase. El 1 de septiembre, cuando el Kc pasa de 1,00 a 0,30, la persistencia se desvía 3,52 mm y el sistema 0,01 mm.</w:t>
+        <w:t>La aportación principal es un resultado empírico que no estaba previsto en el anteproyecto. En este piloto, para anticipar la necesidad de riego de un cultivo con calendario definido, separar la estimación en sus dos componentes resultó más eficaz que aumentar la complejidad del modelo. Uno de ellos, la demanda atmosférica, es incierto pero evoluciona de forma gradual; el otro, el coeficiente de cultivo, cambia de forma brusca pero se conoce de antemano. La vía que multiplica la ET0 media de los siete días anteriores por el Kc del día objetivo reduce el MAE de la recomendación a un día frente a la persistencia en un 7 % en desarrollo y en un 25 % en la prueba, y el RMSE de desarrollo en un 18 %. La diferencia se amplía con la anticipación: a siete días, en el periodo de desarrollo, el error del sistema es de 0,48 mm frente a 0,87 mm de la persistencia, porque se mantiene prácticamente estable a lo largo del horizonte. Donde el método se distingue con más claridad es en los cambios de fase. El 1 de septiembre, cuando el Kc pasa de 1,00 a 0,30, la persistencia se desvía 3,52 mm y el sistema 0,01 mm.</w:t>
       </w:r>
     </w:p>
     <w:p>
@@ -28268,7 +28268,7 @@
         <w:spacing w:after="120"/>
       </w:pPr>
       <w:r>
-        <w:t xml:space="preserve">La segunda aportación es un resultado negativo bien acotado. Seis enfoques, desde la persistencia hasta XGBoost, se compararon con las mismas variables, los mismos cortes temporales y una prueba reservada que no intervino en la selección, y ninguno de los cinco algoritmos de aprendizaje superó de forma estable a la referencia más simple. Este resultado no resta valor al trabajo. Es coherente con lo expuesto en el apartado 2.2: con un único ciclo de 148 observaciones y una necesidad neta dominada por el calendario del cultivo (su correlación con el Kc es de 0,93), la complejidad añadida no encuentra señal que aprender. Su fiabilidad descansa en dos decisiones documentadas. La primera fue excluir la ET0, la ETc y la precipitación efectiva del mismo día, que habrían permitido reconstruir el objetivo de forma algebraica y producir métricas aparentemente excelentes. La segunda, seleccionar el enfoque antes de consultar la prueba final. Leídos conjuntamente, los capítulos 4 y 5 respaldan el planteamiento híbrido del apartado 2.3: con pocos datos, el conocimiento agronómico explícito aporta más que el algoritmo, y el aprendizaje automático encuentra su lugar como corrección de una referencia física, no como sustituto de ella.</w:t>
+        <w:t>La segunda aportación es un resultado negativo bien acotado. Seis enfoques, desde la persistencia hasta XGBoost, se compararon sobre la misma variable objetivo, los mismos cortes temporales y una prueba reservada que no intervino en la selección. Los cinco algoritmos de aprendizaje utilizaron el conjunto de variables definido en el apartado 4.3; la persistencia utilizó el último valor observado. Ninguno de los algoritmos de aprendizaje superó de forma estable a esta referencia sencilla. Este resultado no resta valor al trabajo. Es coherente con lo expuesto en el apartado 2.2: con un único ciclo de 148 observaciones y una necesidad neta muy relacionada con el calendario del cultivo (su correlación con el Kc es de 0,93), los modelos más complejos no disponen de diversidad suficiente para demostrar una mejora estable. La fiabilidad de la comparación descansa en dos decisiones documentadas. La primera fue excluir la ET0, la ETc y la precipitación efectiva del mismo día, que habrían permitido reconstruir el objetivo de forma algebraica y producir métricas aparentemente excelentes. La segunda, seleccionar el enfoque antes de consultar la prueba final. Leídos conjuntamente, los capítulos 4 y 5 respaldan el planteamiento híbrido del apartado 2.3: con pocos datos, el conocimiento agronómico explícito aporta más que el algoritmo, y el aprendizaje automático encuentra su lugar como corrección de una referencia física, no como sustituto de ella.</w:t>
       </w:r>
     </w:p>
     <w:p>
@@ -28276,7 +28276,7 @@
         <w:spacing w:after="120"/>
       </w:pPr>
       <w:r>
-        <w:t xml:space="preserve">La tercera aportación es de diseño. El motor convierte la incertidumbre en parte de la salida en lugar de ocultarla. Cada recomendación indica el método que la produjo, las reglas aplicadas, el último dato observado, un nivel de confianza y el error esperado para su día del horizonte, y el sistema prefiere no emitir una dosis antes que ofrecer una cifra sin fundamento. Ninguna ausencia se convierte en cero y ninguna dosis resulta negativa. Las pruebas automáticas verifican, además, que la planificación no cambia cuando se alteran los datos posteriores a la fecha de emisión, que es la garantía formal de que el sistema no utiliza información futura.</w:t>
+        <w:t>La tercera aportación es de diseño. El motor hace visibles sus limitaciones en la salida. Cada recomendación indica el método que la produjo, las reglas aplicadas, el último dato observado, un nivel de confianza y, cuando está disponible el informe de validación, el error medio para su día del horizonte. Si falta información imprescindible no se emite una dosis; si los datos son antiguos, se conserva la estimación con un aviso y confianza baja. Las filas sin estimación permanecen ausentes, no se convierten en dosis cero, y ninguna dosis emitida resulta negativa. Las pruebas automáticas verifican, además, que la planificación no cambia cuando se alteran los datos posteriores a la fecha de emisión, que es la garantía formal de que el sistema no utiliza información futura.</w:t>
       </w:r>
     </w:p>
     <w:p>
@@ -28284,7 +28284,7 @@
         <w:spacing w:after="120"/>
       </w:pPr>
       <w:r>
-        <w:t xml:space="preserve">La cuarta aportación es la reproducibilidad. Todas las cifras, tablas y figuras de los capítulos 4 y 5 se regeneran con un comando desde el repositorio, las cincuenta y cinco pruebas automáticas se superan en un entorno limpio y el sistema de recomendación puede ejecutarse sin credenciales a partir del CSV oficial versionado. La correspondencia entre la memoria y el código no es, por tanto, una declaración, sino algo que cualquier lector puede comprobar.</w:t>
+        <w:t>La cuarta aportación es la reproducibilidad. El repositorio conserva los datos del piloto, los informes de evaluación y los módulos que generan las principales evidencias cuantitativas y visualizaciones de los capítulos 4 y 5; el README documenta los comandos separados para ejecutar cada fase. Las cincuenta y cinco pruebas automáticas se han ejecutado correctamente en el entorno local del proyecto y el motor de recomendación puede utilizar el CSV oficial versionado sin nuevas credenciales. Así, el lector puede comprobar la correspondencia entre la memoria y el código, siempre que disponga de las dependencias indicadas.</w:t>
       </w:r>
     </w:p>
     <w:p>
@@ -28360,6 +28360,7 @@
     <w:p>
       <w:pPr>
         <w:keepNext/>
+        <w:pageBreakBefore w:val="0"/>
         <w:spacing w:after="120"/>
       </w:pPr>
       <w:r>
@@ -29139,7 +29140,7 @@
         <w:spacing w:after="120"/>
       </w:pPr>
       <w:r>
-        <w:t xml:space="preserve">La primera mejora consiste en ampliar el conjunto con varias campañas, otras estaciones de Almería y, después, otros cultivos. La ETL ya está parametrizada por estación, cultivo y periodo, de modo que el coste principal es la descarga, sujeta a las cuotas de SiAR, y la revisión de calidad. Con varias campañas podrá validarse por bloques completos, reservando campañas y estaciones enteras para medir la generalización temporal y espacial sin estimaciones optimistas del error (Roberts et al., 2017). Esta ampliación permitirá comprobar si la ventaja de la vía ET0 × Kc se mantiene en cultivos con un coeficiente de variación gradual y repetir con más datos la comparación de los seis enfoques del capítulo 4.</w:t>
+        <w:t>La primera mejora consiste en ampliar el conjunto con varias campañas, otras estaciones de Almería y, después, otros cultivos. La extracción meteorológica ya admite estación y periodo, pero las necesidades del cultivo se incorporan mediante un CSV descargado de la web de SiAR y sus metadatos. Antes de ampliar el piloto habrá que permitir seleccionar de forma explícita ese archivo y validar la correspondencia entre estación, cultivo y fechas; hoy la ETL toma el CSV más recientemente modificado. Las cuotas de la API afectan a la descarga climática, mientras que los CSV de necesidades requieren una gestión separada y una nueva revisión de calidad. Con varias campañas podrá validarse por bloques completos, reservando campañas y estaciones enteras para medir la generalización temporal y espacial sin estimaciones optimistas del error (Roberts et al., 2017). Esta ampliación permitirá comprobar si la ventaja de la vía ET0 × Kc se mantiene en cultivos con un coeficiente de variación gradual y repetir con más datos la comparación de los seis enfoques del capítulo 4.</w:t>
       </w:r>
     </w:p>
     <w:p>
@@ -29161,7 +29162,7 @@
         <w:spacing w:after="120"/>
       </w:pPr>
       <w:r>
-        <w:t xml:space="preserve">La mejora con mayor efecto sobre la precisión es incorporar una ET0 prevista, única vía para anticipar cambios de tiempo en los días 4 a 7 del horizonte. El motor ya admite esta entrada, de modo que el trabajo pendiente es de datos y de evaluación. La predicción municipal de AEMET OpenData describe los días posteriores a cada emisión y el proyecto no dispone de emisiones pasadas, por lo que el histórico debe construirse archivando de forma programada cada predicción. Con ese histórico podrán compararse dos alternativas: estimar la ET0 con la ecuación de Hargreaves calibrada frente a la ET0 de Penman-Monteith observada en la estación (Allen et al., 1998), o utilizar el producto pronosticado de SiAR. Cualquiera de ellas debe evaluarse con la misma disciplina temporal que el resto del trabajo, utilizando solo predicciones emitidas antes de cada fecha objetivo, y sustituir a la vía actual únicamente si mejora el error por horizonte de la Tabla 5.5. El mismo archivo permitirá evaluar si conviene descontar la lluvia prevista en lugar de limitarse a avisar.</w:t>
+        <w:t>Una mejora prioritaria para anticipar cambios de tiempo es incorporar una ET0 prevista, especialmente en los días 4 a 7 del horizonte. El motor ya admite esta entrada, de modo que el trabajo pendiente es de datos y de evaluación. La predicción municipal de AEMET OpenData describe los días posteriores a cada emisión y el proyecto no dispone de emisiones pasadas, por lo que el histórico debe construirse archivando de forma programada cada predicción. Con ese histórico podrán compararse dos alternativas: estimar la ET0 con la ecuación de Hargreaves calibrada frente a la ET0 de Penman-Monteith observada en la estación (Allen et al., 1998), o estudiar el pronóstico de necesidades netas que publica SiAR, calculado con previsiones de ET0 y lluvia de AEMET. Este último cubre seis días (Sistema de Información Agroclimática para el Regadío, s. f.), por lo que no resuelve por sí solo el séptimo día del horizonte del DSS. Además, si se usa como entrada, su comparación con la referencia SiAR debe declararse como contraste entre productos relacionados, no como validación independiente. Cualquiera de estas vías debe evaluarse con la misma disciplina temporal que el resto del trabajo, utilizando solo predicciones emitidas antes de cada fecha objetivo, y sustituir a la vía actual únicamente si mejora el error por horizonte de la Tabla 5.5. El mismo archivo permitirá evaluar si conviene descontar la lluvia prevista en lugar de limitarse a avisar.</w:t>
       </w:r>
     </w:p>
     <w:p>
@@ -29836,6 +29837,23 @@
           <w:i w:val="0"/>
         </w:rPr>
         <w:t>(2), 111–126. https://doi.org/10.1016/S0167-9236(01)00139-7</w:t>
+      </w:r>
+    </w:p>
+    <w:p>
+      <w:pPr>
+        <w:pStyle w:val="BibliografíaAPA"/>
+      </w:pPr>
+      <w:r>
+        <w:t xml:space="preserve">Sistema de Información Agroclimática para el Regadío (SiAR). (s. f.). </w:t>
+      </w:r>
+      <w:r>
+        <w:rPr>
+          <w:i/>
+        </w:rPr>
+        <w:t>Manual de uso de la web SiAR</w:t>
+      </w:r>
+      <w:r>
+        <w:t>. https://servicio.mapa.gob.es/siarweb/documentos/manuales/ManualUsoWebSiAR.pdf</w:t>
       </w:r>
     </w:p>
     <w:p>

</xml_diff>